<commit_message>
Fig Tool display bug
</commit_message>
<xml_diff>
--- a/Guide_Complet_Lemon_Squeezy.docx
+++ b/Guide_Complet_Lemon_Squeezy.docx
@@ -137,7 +137,7 @@
           <w:color w:val="555555"/>
           <w:sz w:val="22"/>
         </w:rPr>
-        <w:t>5. Confirmation Modal (Thank You Page)</w:t>
+        <w:t>5. Confirmation modal</w:t>
       </w:r>
     </w:p>
     <w:p>
@@ -2048,7 +2048,7 @@
                 <w:rFonts w:ascii="Arial" w:hAnsi="Arial"/>
                 <w:sz w:val="18"/>
               </w:rPr>
-              <w:t>https://theprompt.studio/dashboard.html?welcome=1</w:t>
+              <w:t>theprompt.studio/dashboard.html?welcome=1</w:t>
             </w:r>
           </w:p>
         </w:tc>
@@ -2705,7 +2705,7 @@
                 <w:b/>
                 <w:sz w:val="18"/>
               </w:rPr>
-              <w:t>Confirmation image (Thank You)</w:t>
+              <w:t>Confirmation modal</w:t>
             </w:r>
           </w:p>
         </w:tc>
@@ -2720,7 +2720,7 @@
                 <w:rFonts w:ascii="Arial" w:hAnsi="Arial"/>
                 <w:sz w:val="18"/>
               </w:rPr>
-              <w:t>confirmation-immo.png — 1600×1200 px</w:t>
+              <w:t>(see Confirmation modal section)</w:t>
             </w:r>
           </w:p>
         </w:tc>
@@ -2742,7 +2742,7 @@
                 <w:b/>
                 <w:sz w:val="18"/>
               </w:rPr>
-              <w:t>Email receipt header</w:t>
+              <w:t>Email receipt</w:t>
             </w:r>
           </w:p>
         </w:tc>
@@ -2757,7 +2757,7 @@
                 <w:rFonts w:ascii="Arial" w:hAnsi="Arial"/>
                 <w:sz w:val="18"/>
               </w:rPr>
-              <w:t>receipt-immo.png — 600×200 px</w:t>
+              <w:t>(empty)</w:t>
             </w:r>
           </w:p>
         </w:tc>
@@ -2771,7 +2771,7 @@
           <w:color w:val="0F1117"/>
           <w:sz w:val="22"/>
         </w:rPr>
-        <w:t>Confirmation Modal (Thank You Page)</w:t>
+        <w:t>Confirmation modal</w:t>
       </w:r>
     </w:p>
     <w:tbl>
@@ -2840,7 +2840,7 @@
                 <w:b/>
                 <w:sz w:val="18"/>
               </w:rPr>
-              <w:t>Image</w:t>
+              <w:t>(image — set in LS)</w:t>
             </w:r>
           </w:p>
         </w:tc>
@@ -2855,7 +2855,7 @@
                 <w:rFonts w:ascii="Arial" w:hAnsi="Arial"/>
                 <w:sz w:val="18"/>
               </w:rPr>
-              <w:t>confirmation-immo.png</w:t>
+              <w:t>(set in LS UI)</w:t>
             </w:r>
           </w:p>
         </w:tc>
@@ -2914,7 +2914,7 @@
                 <w:b/>
                 <w:sz w:val="18"/>
               </w:rPr>
-              <w:t>Subtitle</w:t>
+              <w:t>Message</w:t>
             </w:r>
           </w:p>
         </w:tc>
@@ -2929,7 +2929,7 @@
                 <w:rFonts w:ascii="Arial" w:hAnsi="Arial"/>
                 <w:sz w:val="18"/>
               </w:rPr>
-              <w:t>Your 7-day free trial starts now.</w:t>
+              <w:t>Thank you for subscribing to The Prompt Studio. Your 7-day free trial is now active. Sign in at https://theprompt.studio to access your tools.</w:t>
             </w:r>
           </w:p>
         </w:tc>
@@ -2951,7 +2951,7 @@
                 <w:b/>
                 <w:sz w:val="18"/>
               </w:rPr>
-              <w:t>Button / Redirect</w:t>
+              <w:t>Button link</w:t>
             </w:r>
           </w:p>
         </w:tc>
@@ -2966,7 +2966,7 @@
                 <w:rFonts w:ascii="Arial" w:hAnsi="Arial"/>
                 <w:sz w:val="18"/>
               </w:rPr>
-              <w:t>https://theprompt.studio/dashboard.html?welcome=1</w:t>
+              <w:t>theprompt.studio/dashboard.html?welcome=1</w:t>
             </w:r>
           </w:p>
         </w:tc>
@@ -2988,7 +2988,7 @@
                 <w:b/>
                 <w:sz w:val="18"/>
               </w:rPr>
-              <w:t>Additional message</w:t>
+              <w:t>Button text</w:t>
             </w:r>
           </w:p>
         </w:tc>
@@ -3003,7 +3003,7 @@
                 <w:rFonts w:ascii="Arial" w:hAnsi="Arial"/>
                 <w:sz w:val="18"/>
               </w:rPr>
-              <w:t>Sign in with your credentials to access your AI tools.</w:t>
+              <w:t>View Order</w:t>
             </w:r>
           </w:p>
         </w:tc>
@@ -3086,7 +3086,7 @@
                 <w:b/>
                 <w:sz w:val="18"/>
               </w:rPr>
-              <w:t>Header image</w:t>
+              <w:t>Thank you note</w:t>
             </w:r>
           </w:p>
         </w:tc>
@@ -3101,7 +3101,7 @@
                 <w:rFonts w:ascii="Arial" w:hAnsi="Arial"/>
                 <w:sz w:val="18"/>
               </w:rPr>
-              <w:t>receipt-immo.png — 600×200 px</w:t>
+              <w:t>(empty)</w:t>
             </w:r>
           </w:p>
         </w:tc>
@@ -3123,7 +3123,7 @@
                 <w:b/>
                 <w:sz w:val="18"/>
               </w:rPr>
-              <w:t>Email subject</w:t>
+              <w:t>Button text</w:t>
             </w:r>
           </w:p>
         </w:tc>
@@ -3138,7 +3138,7 @@
                 <w:rFonts w:ascii="Arial" w:hAnsi="Arial"/>
                 <w:sz w:val="18"/>
               </w:rPr>
-              <w:t>Your subscription — AI Toolkit Real Estate</w:t>
+              <w:t>View Order</w:t>
             </w:r>
           </w:p>
         </w:tc>
@@ -3160,7 +3160,7 @@
                 <w:b/>
                 <w:sz w:val="18"/>
               </w:rPr>
-              <w:t>Custom text</w:t>
+              <w:t>Button link</w:t>
             </w:r>
           </w:p>
         </w:tc>
@@ -3175,7 +3175,7 @@
                 <w:rFonts w:ascii="Arial" w:hAnsi="Arial"/>
                 <w:sz w:val="18"/>
               </w:rPr>
-              <w:t>Thank you for subscribing to the AI Toolkit Real Estate on The Prompt Studio. Your 7-day free trial is now active. Sign in at https://theprompt.studio to access your tools.</w:t>
+              <w:t>app.lemonsqueezy.com/my-orders</w:t>
             </w:r>
           </w:p>
         </w:tc>
@@ -3197,7 +3197,7 @@
                 <w:b/>
                 <w:sz w:val="18"/>
               </w:rPr>
-              <w:t>Footer</w:t>
+              <w:t>(footer — auto by LS)</w:t>
             </w:r>
           </w:p>
         </w:tc>
@@ -3212,7 +3212,7 @@
                 <w:rFonts w:ascii="Arial" w:hAnsi="Arial"/>
                 <w:sz w:val="18"/>
               </w:rPr>
-              <w:t>The Prompt Studio — theprompt.studio — support@theprompt.studio</w:t>
+              <w:t>(auto by LS)</w:t>
             </w:r>
           </w:p>
         </w:tc>
@@ -4541,7 +4541,7 @@
                 <w:b/>
                 <w:sz w:val="18"/>
               </w:rPr>
-              <w:t>Confirmation image (Thank You)</w:t>
+              <w:t>Confirmation modal</w:t>
             </w:r>
           </w:p>
         </w:tc>
@@ -4556,7 +4556,7 @@
                 <w:rFonts w:ascii="Arial" w:hAnsi="Arial"/>
                 <w:sz w:val="18"/>
               </w:rPr>
-              <w:t>confirmation-commerce.png — 1600×1200 px</w:t>
+              <w:t>(see Confirmation modal section)</w:t>
             </w:r>
           </w:p>
         </w:tc>
@@ -4578,7 +4578,7 @@
                 <w:b/>
                 <w:sz w:val="18"/>
               </w:rPr>
-              <w:t>Email receipt header</w:t>
+              <w:t>Email receipt</w:t>
             </w:r>
           </w:p>
         </w:tc>
@@ -4593,7 +4593,7 @@
                 <w:rFonts w:ascii="Arial" w:hAnsi="Arial"/>
                 <w:sz w:val="18"/>
               </w:rPr>
-              <w:t>receipt-commerce.png — 600×200 px</w:t>
+              <w:t>(empty)</w:t>
             </w:r>
           </w:p>
         </w:tc>
@@ -4607,7 +4607,7 @@
           <w:color w:val="0F1117"/>
           <w:sz w:val="22"/>
         </w:rPr>
-        <w:t>Confirmation Modal (Thank You Page)</w:t>
+        <w:t>Confirmation modal</w:t>
       </w:r>
     </w:p>
     <w:tbl>
@@ -4676,7 +4676,7 @@
                 <w:b/>
                 <w:sz w:val="18"/>
               </w:rPr>
-              <w:t>Image</w:t>
+              <w:t>(image — set in LS)</w:t>
             </w:r>
           </w:p>
         </w:tc>
@@ -4691,7 +4691,7 @@
                 <w:rFonts w:ascii="Arial" w:hAnsi="Arial"/>
                 <w:sz w:val="18"/>
               </w:rPr>
-              <w:t>confirmation-commerce.png</w:t>
+              <w:t>(set in LS UI)</w:t>
             </w:r>
           </w:p>
         </w:tc>
@@ -4750,7 +4750,7 @@
                 <w:b/>
                 <w:sz w:val="18"/>
               </w:rPr>
-              <w:t>Subtitle</w:t>
+              <w:t>Message</w:t>
             </w:r>
           </w:p>
         </w:tc>
@@ -4765,7 +4765,7 @@
                 <w:rFonts w:ascii="Arial" w:hAnsi="Arial"/>
                 <w:sz w:val="18"/>
               </w:rPr>
-              <w:t>Your 7-day free trial starts now.</w:t>
+              <w:t>Thank you for subscribing to The Prompt Studio. Your 7-day free trial is now active. Sign in at https://theprompt.studio to access your tools.</w:t>
             </w:r>
           </w:p>
         </w:tc>
@@ -4787,7 +4787,7 @@
                 <w:b/>
                 <w:sz w:val="18"/>
               </w:rPr>
-              <w:t>Button / Redirect</w:t>
+              <w:t>Button link</w:t>
             </w:r>
           </w:p>
         </w:tc>
@@ -4802,7 +4802,7 @@
                 <w:rFonts w:ascii="Arial" w:hAnsi="Arial"/>
                 <w:sz w:val="18"/>
               </w:rPr>
-              <w:t>https://theprompt.studio/dashboard.html?welcome=1</w:t>
+              <w:t>theprompt.studio/dashboard.html?welcome=1</w:t>
             </w:r>
           </w:p>
         </w:tc>
@@ -4824,7 +4824,7 @@
                 <w:b/>
                 <w:sz w:val="18"/>
               </w:rPr>
-              <w:t>Additional message</w:t>
+              <w:t>Button text</w:t>
             </w:r>
           </w:p>
         </w:tc>
@@ -4839,7 +4839,7 @@
                 <w:rFonts w:ascii="Arial" w:hAnsi="Arial"/>
                 <w:sz w:val="18"/>
               </w:rPr>
-              <w:t>Sign in with your credentials to access your AI tools.</w:t>
+              <w:t>View Order</w:t>
             </w:r>
           </w:p>
         </w:tc>
@@ -4922,7 +4922,7 @@
                 <w:b/>
                 <w:sz w:val="18"/>
               </w:rPr>
-              <w:t>Header image</w:t>
+              <w:t>Thank you note</w:t>
             </w:r>
           </w:p>
         </w:tc>
@@ -4937,7 +4937,7 @@
                 <w:rFonts w:ascii="Arial" w:hAnsi="Arial"/>
                 <w:sz w:val="18"/>
               </w:rPr>
-              <w:t>receipt-commerce.png — 600×200 px</w:t>
+              <w:t>(empty)</w:t>
             </w:r>
           </w:p>
         </w:tc>
@@ -4959,7 +4959,7 @@
                 <w:b/>
                 <w:sz w:val="18"/>
               </w:rPr>
-              <w:t>Email subject</w:t>
+              <w:t>Button text</w:t>
             </w:r>
           </w:p>
         </w:tc>
@@ -4974,7 +4974,7 @@
                 <w:rFonts w:ascii="Arial" w:hAnsi="Arial"/>
                 <w:sz w:val="18"/>
               </w:rPr>
-              <w:t>Your subscription — AI Toolkit E-Commerce &amp; Retail</w:t>
+              <w:t>View Order</w:t>
             </w:r>
           </w:p>
         </w:tc>
@@ -4996,7 +4996,7 @@
                 <w:b/>
                 <w:sz w:val="18"/>
               </w:rPr>
-              <w:t>Custom text</w:t>
+              <w:t>Button link</w:t>
             </w:r>
           </w:p>
         </w:tc>
@@ -5011,7 +5011,7 @@
                 <w:rFonts w:ascii="Arial" w:hAnsi="Arial"/>
                 <w:sz w:val="18"/>
               </w:rPr>
-              <w:t>Thank you for subscribing to the AI Toolkit E-Commerce &amp; Retail on The Prompt Studio. Your 7-day free trial is now active. Sign in at https://theprompt.studio to access your tools.</w:t>
+              <w:t>app.lemonsqueezy.com/my-orders</w:t>
             </w:r>
           </w:p>
         </w:tc>
@@ -5033,7 +5033,7 @@
                 <w:b/>
                 <w:sz w:val="18"/>
               </w:rPr>
-              <w:t>Footer</w:t>
+              <w:t>(footer — auto by LS)</w:t>
             </w:r>
           </w:p>
         </w:tc>
@@ -5048,7 +5048,7 @@
                 <w:rFonts w:ascii="Arial" w:hAnsi="Arial"/>
                 <w:sz w:val="18"/>
               </w:rPr>
-              <w:t>The Prompt Studio — theprompt.studio — support@theprompt.studio</w:t>
+              <w:t>(auto by LS)</w:t>
             </w:r>
           </w:p>
         </w:tc>
@@ -6377,7 +6377,7 @@
                 <w:b/>
                 <w:sz w:val="18"/>
               </w:rPr>
-              <w:t>Confirmation image (Thank You)</w:t>
+              <w:t>Confirmation modal</w:t>
             </w:r>
           </w:p>
         </w:tc>
@@ -6392,7 +6392,7 @@
                 <w:rFonts w:ascii="Arial" w:hAnsi="Arial"/>
                 <w:sz w:val="18"/>
               </w:rPr>
-              <w:t>confirmation-legal.png — 1600×1200 px</w:t>
+              <w:t>(see Confirmation modal section)</w:t>
             </w:r>
           </w:p>
         </w:tc>
@@ -6414,7 +6414,7 @@
                 <w:b/>
                 <w:sz w:val="18"/>
               </w:rPr>
-              <w:t>Email receipt header</w:t>
+              <w:t>Email receipt</w:t>
             </w:r>
           </w:p>
         </w:tc>
@@ -6429,7 +6429,7 @@
                 <w:rFonts w:ascii="Arial" w:hAnsi="Arial"/>
                 <w:sz w:val="18"/>
               </w:rPr>
-              <w:t>receipt-legal.png — 600×200 px</w:t>
+              <w:t>(empty)</w:t>
             </w:r>
           </w:p>
         </w:tc>
@@ -6443,7 +6443,7 @@
           <w:color w:val="0F1117"/>
           <w:sz w:val="22"/>
         </w:rPr>
-        <w:t>Confirmation Modal (Thank You Page)</w:t>
+        <w:t>Confirmation modal</w:t>
       </w:r>
     </w:p>
     <w:tbl>
@@ -6512,7 +6512,7 @@
                 <w:b/>
                 <w:sz w:val="18"/>
               </w:rPr>
-              <w:t>Image</w:t>
+              <w:t>(image — set in LS)</w:t>
             </w:r>
           </w:p>
         </w:tc>
@@ -6527,7 +6527,7 @@
                 <w:rFonts w:ascii="Arial" w:hAnsi="Arial"/>
                 <w:sz w:val="18"/>
               </w:rPr>
-              <w:t>confirmation-legal.png</w:t>
+              <w:t>(set in LS UI)</w:t>
             </w:r>
           </w:p>
         </w:tc>
@@ -6586,7 +6586,7 @@
                 <w:b/>
                 <w:sz w:val="18"/>
               </w:rPr>
-              <w:t>Subtitle</w:t>
+              <w:t>Message</w:t>
             </w:r>
           </w:p>
         </w:tc>
@@ -6601,7 +6601,7 @@
                 <w:rFonts w:ascii="Arial" w:hAnsi="Arial"/>
                 <w:sz w:val="18"/>
               </w:rPr>
-              <w:t>Your 7-day free trial starts now.</w:t>
+              <w:t>Thank you for subscribing to The Prompt Studio. Your 7-day free trial is now active. Sign in at https://theprompt.studio to access your tools.</w:t>
             </w:r>
           </w:p>
         </w:tc>
@@ -6623,7 +6623,7 @@
                 <w:b/>
                 <w:sz w:val="18"/>
               </w:rPr>
-              <w:t>Button / Redirect</w:t>
+              <w:t>Button link</w:t>
             </w:r>
           </w:p>
         </w:tc>
@@ -6638,7 +6638,7 @@
                 <w:rFonts w:ascii="Arial" w:hAnsi="Arial"/>
                 <w:sz w:val="18"/>
               </w:rPr>
-              <w:t>https://theprompt.studio/dashboard.html?welcome=1</w:t>
+              <w:t>theprompt.studio/dashboard.html?welcome=1</w:t>
             </w:r>
           </w:p>
         </w:tc>
@@ -6660,7 +6660,7 @@
                 <w:b/>
                 <w:sz w:val="18"/>
               </w:rPr>
-              <w:t>Additional message</w:t>
+              <w:t>Button text</w:t>
             </w:r>
           </w:p>
         </w:tc>
@@ -6675,7 +6675,7 @@
                 <w:rFonts w:ascii="Arial" w:hAnsi="Arial"/>
                 <w:sz w:val="18"/>
               </w:rPr>
-              <w:t>Sign in with your credentials to access your AI tools.</w:t>
+              <w:t>View Order</w:t>
             </w:r>
           </w:p>
         </w:tc>
@@ -6758,7 +6758,7 @@
                 <w:b/>
                 <w:sz w:val="18"/>
               </w:rPr>
-              <w:t>Header image</w:t>
+              <w:t>Thank you note</w:t>
             </w:r>
           </w:p>
         </w:tc>
@@ -6773,7 +6773,7 @@
                 <w:rFonts w:ascii="Arial" w:hAnsi="Arial"/>
                 <w:sz w:val="18"/>
               </w:rPr>
-              <w:t>receipt-legal.png — 600×200 px</w:t>
+              <w:t>(empty)</w:t>
             </w:r>
           </w:p>
         </w:tc>
@@ -6795,7 +6795,7 @@
                 <w:b/>
                 <w:sz w:val="18"/>
               </w:rPr>
-              <w:t>Email subject</w:t>
+              <w:t>Button text</w:t>
             </w:r>
           </w:p>
         </w:tc>
@@ -6810,7 +6810,7 @@
                 <w:rFonts w:ascii="Arial" w:hAnsi="Arial"/>
                 <w:sz w:val="18"/>
               </w:rPr>
-              <w:t>Your subscription — AI Toolkit Legal</w:t>
+              <w:t>View Order</w:t>
             </w:r>
           </w:p>
         </w:tc>
@@ -6832,7 +6832,7 @@
                 <w:b/>
                 <w:sz w:val="18"/>
               </w:rPr>
-              <w:t>Custom text</w:t>
+              <w:t>Button link</w:t>
             </w:r>
           </w:p>
         </w:tc>
@@ -6847,7 +6847,7 @@
                 <w:rFonts w:ascii="Arial" w:hAnsi="Arial"/>
                 <w:sz w:val="18"/>
               </w:rPr>
-              <w:t>Thank you for subscribing to the AI Toolkit Legal on The Prompt Studio. Your 7-day free trial is now active. Sign in at https://theprompt.studio to access your tools.</w:t>
+              <w:t>app.lemonsqueezy.com/my-orders</w:t>
             </w:r>
           </w:p>
         </w:tc>
@@ -6869,7 +6869,7 @@
                 <w:b/>
                 <w:sz w:val="18"/>
               </w:rPr>
-              <w:t>Footer</w:t>
+              <w:t>(footer — auto by LS)</w:t>
             </w:r>
           </w:p>
         </w:tc>
@@ -6884,7 +6884,7 @@
                 <w:rFonts w:ascii="Arial" w:hAnsi="Arial"/>
                 <w:sz w:val="18"/>
               </w:rPr>
-              <w:t>The Prompt Studio — theprompt.studio — support@theprompt.studio</w:t>
+              <w:t>(auto by LS)</w:t>
             </w:r>
           </w:p>
         </w:tc>
@@ -8213,7 +8213,7 @@
                 <w:b/>
                 <w:sz w:val="18"/>
               </w:rPr>
-              <w:t>Confirmation image (Thank You)</w:t>
+              <w:t>Confirmation modal</w:t>
             </w:r>
           </w:p>
         </w:tc>
@@ -8228,7 +8228,7 @@
                 <w:rFonts w:ascii="Arial" w:hAnsi="Arial"/>
                 <w:sz w:val="18"/>
               </w:rPr>
-              <w:t>confirmation-finance.png — 1600×1200 px</w:t>
+              <w:t>(see Confirmation modal section)</w:t>
             </w:r>
           </w:p>
         </w:tc>
@@ -8250,7 +8250,7 @@
                 <w:b/>
                 <w:sz w:val="18"/>
               </w:rPr>
-              <w:t>Email receipt header</w:t>
+              <w:t>Email receipt</w:t>
             </w:r>
           </w:p>
         </w:tc>
@@ -8265,7 +8265,7 @@
                 <w:rFonts w:ascii="Arial" w:hAnsi="Arial"/>
                 <w:sz w:val="18"/>
               </w:rPr>
-              <w:t>receipt-finance.png — 600×200 px</w:t>
+              <w:t>(empty)</w:t>
             </w:r>
           </w:p>
         </w:tc>
@@ -8279,7 +8279,7 @@
           <w:color w:val="0F1117"/>
           <w:sz w:val="22"/>
         </w:rPr>
-        <w:t>Confirmation Modal (Thank You Page)</w:t>
+        <w:t>Confirmation modal</w:t>
       </w:r>
     </w:p>
     <w:tbl>
@@ -8348,7 +8348,7 @@
                 <w:b/>
                 <w:sz w:val="18"/>
               </w:rPr>
-              <w:t>Image</w:t>
+              <w:t>(image — set in LS)</w:t>
             </w:r>
           </w:p>
         </w:tc>
@@ -8363,7 +8363,7 @@
                 <w:rFonts w:ascii="Arial" w:hAnsi="Arial"/>
                 <w:sz w:val="18"/>
               </w:rPr>
-              <w:t>confirmation-finance.png</w:t>
+              <w:t>(set in LS UI)</w:t>
             </w:r>
           </w:p>
         </w:tc>
@@ -8422,7 +8422,7 @@
                 <w:b/>
                 <w:sz w:val="18"/>
               </w:rPr>
-              <w:t>Subtitle</w:t>
+              <w:t>Message</w:t>
             </w:r>
           </w:p>
         </w:tc>
@@ -8437,7 +8437,7 @@
                 <w:rFonts w:ascii="Arial" w:hAnsi="Arial"/>
                 <w:sz w:val="18"/>
               </w:rPr>
-              <w:t>Your 7-day free trial starts now.</w:t>
+              <w:t>Thank you for subscribing to The Prompt Studio. Your 7-day free trial is now active. Sign in at https://theprompt.studio to access your tools.</w:t>
             </w:r>
           </w:p>
         </w:tc>
@@ -8459,7 +8459,7 @@
                 <w:b/>
                 <w:sz w:val="18"/>
               </w:rPr>
-              <w:t>Button / Redirect</w:t>
+              <w:t>Button link</w:t>
             </w:r>
           </w:p>
         </w:tc>
@@ -8474,7 +8474,7 @@
                 <w:rFonts w:ascii="Arial" w:hAnsi="Arial"/>
                 <w:sz w:val="18"/>
               </w:rPr>
-              <w:t>https://theprompt.studio/dashboard.html?welcome=1</w:t>
+              <w:t>theprompt.studio/dashboard.html?welcome=1</w:t>
             </w:r>
           </w:p>
         </w:tc>
@@ -8496,7 +8496,7 @@
                 <w:b/>
                 <w:sz w:val="18"/>
               </w:rPr>
-              <w:t>Additional message</w:t>
+              <w:t>Button text</w:t>
             </w:r>
           </w:p>
         </w:tc>
@@ -8511,7 +8511,7 @@
                 <w:rFonts w:ascii="Arial" w:hAnsi="Arial"/>
                 <w:sz w:val="18"/>
               </w:rPr>
-              <w:t>Sign in with your credentials to access your AI tools.</w:t>
+              <w:t>View Order</w:t>
             </w:r>
           </w:p>
         </w:tc>
@@ -8594,7 +8594,7 @@
                 <w:b/>
                 <w:sz w:val="18"/>
               </w:rPr>
-              <w:t>Header image</w:t>
+              <w:t>Thank you note</w:t>
             </w:r>
           </w:p>
         </w:tc>
@@ -8609,7 +8609,7 @@
                 <w:rFonts w:ascii="Arial" w:hAnsi="Arial"/>
                 <w:sz w:val="18"/>
               </w:rPr>
-              <w:t>receipt-finance.png — 600×200 px</w:t>
+              <w:t>(empty)</w:t>
             </w:r>
           </w:p>
         </w:tc>
@@ -8631,7 +8631,7 @@
                 <w:b/>
                 <w:sz w:val="18"/>
               </w:rPr>
-              <w:t>Email subject</w:t>
+              <w:t>Button text</w:t>
             </w:r>
           </w:p>
         </w:tc>
@@ -8646,7 +8646,7 @@
                 <w:rFonts w:ascii="Arial" w:hAnsi="Arial"/>
                 <w:sz w:val="18"/>
               </w:rPr>
-              <w:t>Your subscription — AI Toolkit Finance &amp; Accounting</w:t>
+              <w:t>View Order</w:t>
             </w:r>
           </w:p>
         </w:tc>
@@ -8668,7 +8668,7 @@
                 <w:b/>
                 <w:sz w:val="18"/>
               </w:rPr>
-              <w:t>Custom text</w:t>
+              <w:t>Button link</w:t>
             </w:r>
           </w:p>
         </w:tc>
@@ -8683,7 +8683,7 @@
                 <w:rFonts w:ascii="Arial" w:hAnsi="Arial"/>
                 <w:sz w:val="18"/>
               </w:rPr>
-              <w:t>Thank you for subscribing to the AI Toolkit Finance &amp; Accounting on The Prompt Studio. Your 7-day free trial is now active. Sign in at https://theprompt.studio to access your tools.</w:t>
+              <w:t>app.lemonsqueezy.com/my-orders</w:t>
             </w:r>
           </w:p>
         </w:tc>
@@ -8705,7 +8705,7 @@
                 <w:b/>
                 <w:sz w:val="18"/>
               </w:rPr>
-              <w:t>Footer</w:t>
+              <w:t>(footer — auto by LS)</w:t>
             </w:r>
           </w:p>
         </w:tc>
@@ -8720,7 +8720,7 @@
                 <w:rFonts w:ascii="Arial" w:hAnsi="Arial"/>
                 <w:sz w:val="18"/>
               </w:rPr>
-              <w:t>The Prompt Studio — theprompt.studio — support@theprompt.studio</w:t>
+              <w:t>(auto by LS)</w:t>
             </w:r>
           </w:p>
         </w:tc>
@@ -10049,7 +10049,7 @@
                 <w:b/>
                 <w:sz w:val="18"/>
               </w:rPr>
-              <w:t>Confirmation image (Thank You)</w:t>
+              <w:t>Confirmation modal</w:t>
             </w:r>
           </w:p>
         </w:tc>
@@ -10064,7 +10064,7 @@
                 <w:rFonts w:ascii="Arial" w:hAnsi="Arial"/>
                 <w:sz w:val="18"/>
               </w:rPr>
-              <w:t>confirmation-marketing.png — 1600×1200 px</w:t>
+              <w:t>(see Confirmation modal section)</w:t>
             </w:r>
           </w:p>
         </w:tc>
@@ -10086,7 +10086,7 @@
                 <w:b/>
                 <w:sz w:val="18"/>
               </w:rPr>
-              <w:t>Email receipt header</w:t>
+              <w:t>Email receipt</w:t>
             </w:r>
           </w:p>
         </w:tc>
@@ -10101,7 +10101,7 @@
                 <w:rFonts w:ascii="Arial" w:hAnsi="Arial"/>
                 <w:sz w:val="18"/>
               </w:rPr>
-              <w:t>receipt-marketing.png — 600×200 px</w:t>
+              <w:t>(empty)</w:t>
             </w:r>
           </w:p>
         </w:tc>
@@ -10115,7 +10115,7 @@
           <w:color w:val="0F1117"/>
           <w:sz w:val="22"/>
         </w:rPr>
-        <w:t>Confirmation Modal (Thank You Page)</w:t>
+        <w:t>Confirmation modal</w:t>
       </w:r>
     </w:p>
     <w:tbl>
@@ -10184,7 +10184,7 @@
                 <w:b/>
                 <w:sz w:val="18"/>
               </w:rPr>
-              <w:t>Image</w:t>
+              <w:t>(image — set in LS)</w:t>
             </w:r>
           </w:p>
         </w:tc>
@@ -10199,7 +10199,7 @@
                 <w:rFonts w:ascii="Arial" w:hAnsi="Arial"/>
                 <w:sz w:val="18"/>
               </w:rPr>
-              <w:t>confirmation-marketing.png</w:t>
+              <w:t>(set in LS UI)</w:t>
             </w:r>
           </w:p>
         </w:tc>
@@ -10258,7 +10258,7 @@
                 <w:b/>
                 <w:sz w:val="18"/>
               </w:rPr>
-              <w:t>Subtitle</w:t>
+              <w:t>Message</w:t>
             </w:r>
           </w:p>
         </w:tc>
@@ -10273,7 +10273,7 @@
                 <w:rFonts w:ascii="Arial" w:hAnsi="Arial"/>
                 <w:sz w:val="18"/>
               </w:rPr>
-              <w:t>Your 7-day free trial starts now.</w:t>
+              <w:t>Thank you for subscribing to The Prompt Studio. Your 7-day free trial is now active. Sign in at https://theprompt.studio to access your tools.</w:t>
             </w:r>
           </w:p>
         </w:tc>
@@ -10295,7 +10295,7 @@
                 <w:b/>
                 <w:sz w:val="18"/>
               </w:rPr>
-              <w:t>Button / Redirect</w:t>
+              <w:t>Button link</w:t>
             </w:r>
           </w:p>
         </w:tc>
@@ -10310,7 +10310,7 @@
                 <w:rFonts w:ascii="Arial" w:hAnsi="Arial"/>
                 <w:sz w:val="18"/>
               </w:rPr>
-              <w:t>https://theprompt.studio/dashboard.html?welcome=1</w:t>
+              <w:t>theprompt.studio/dashboard.html?welcome=1</w:t>
             </w:r>
           </w:p>
         </w:tc>
@@ -10332,7 +10332,7 @@
                 <w:b/>
                 <w:sz w:val="18"/>
               </w:rPr>
-              <w:t>Additional message</w:t>
+              <w:t>Button text</w:t>
             </w:r>
           </w:p>
         </w:tc>
@@ -10347,7 +10347,7 @@
                 <w:rFonts w:ascii="Arial" w:hAnsi="Arial"/>
                 <w:sz w:val="18"/>
               </w:rPr>
-              <w:t>Sign in with your credentials to access your AI tools.</w:t>
+              <w:t>View Order</w:t>
             </w:r>
           </w:p>
         </w:tc>
@@ -10430,7 +10430,7 @@
                 <w:b/>
                 <w:sz w:val="18"/>
               </w:rPr>
-              <w:t>Header image</w:t>
+              <w:t>Thank you note</w:t>
             </w:r>
           </w:p>
         </w:tc>
@@ -10445,7 +10445,7 @@
                 <w:rFonts w:ascii="Arial" w:hAnsi="Arial"/>
                 <w:sz w:val="18"/>
               </w:rPr>
-              <w:t>receipt-marketing.png — 600×200 px</w:t>
+              <w:t>(empty)</w:t>
             </w:r>
           </w:p>
         </w:tc>
@@ -10467,7 +10467,7 @@
                 <w:b/>
                 <w:sz w:val="18"/>
               </w:rPr>
-              <w:t>Email subject</w:t>
+              <w:t>Button text</w:t>
             </w:r>
           </w:p>
         </w:tc>
@@ -10482,7 +10482,7 @@
                 <w:rFonts w:ascii="Arial" w:hAnsi="Arial"/>
                 <w:sz w:val="18"/>
               </w:rPr>
-              <w:t>Your subscription — AI Toolkit Marketing &amp; Comms</w:t>
+              <w:t>View Order</w:t>
             </w:r>
           </w:p>
         </w:tc>
@@ -10504,7 +10504,7 @@
                 <w:b/>
                 <w:sz w:val="18"/>
               </w:rPr>
-              <w:t>Custom text</w:t>
+              <w:t>Button link</w:t>
             </w:r>
           </w:p>
         </w:tc>
@@ -10519,7 +10519,7 @@
                 <w:rFonts w:ascii="Arial" w:hAnsi="Arial"/>
                 <w:sz w:val="18"/>
               </w:rPr>
-              <w:t>Thank you for subscribing to the AI Toolkit Marketing &amp; Comms on The Prompt Studio. Your 7-day free trial is now active. Sign in at https://theprompt.studio to access your tools.</w:t>
+              <w:t>app.lemonsqueezy.com/my-orders</w:t>
             </w:r>
           </w:p>
         </w:tc>
@@ -10541,7 +10541,7 @@
                 <w:b/>
                 <w:sz w:val="18"/>
               </w:rPr>
-              <w:t>Footer</w:t>
+              <w:t>(footer — auto by LS)</w:t>
             </w:r>
           </w:p>
         </w:tc>
@@ -10556,7 +10556,7 @@
                 <w:rFonts w:ascii="Arial" w:hAnsi="Arial"/>
                 <w:sz w:val="18"/>
               </w:rPr>
-              <w:t>The Prompt Studio — theprompt.studio — support@theprompt.studio</w:t>
+              <w:t>(auto by LS)</w:t>
             </w:r>
           </w:p>
         </w:tc>
@@ -11885,7 +11885,7 @@
                 <w:b/>
                 <w:sz w:val="18"/>
               </w:rPr>
-              <w:t>Confirmation image (Thank You)</w:t>
+              <w:t>Confirmation modal</w:t>
             </w:r>
           </w:p>
         </w:tc>
@@ -11900,7 +11900,7 @@
                 <w:rFonts w:ascii="Arial" w:hAnsi="Arial"/>
                 <w:sz w:val="18"/>
               </w:rPr>
-              <w:t>confirmation-rh.png — 1600×1200 px</w:t>
+              <w:t>(see Confirmation modal section)</w:t>
             </w:r>
           </w:p>
         </w:tc>
@@ -11922,7 +11922,7 @@
                 <w:b/>
                 <w:sz w:val="18"/>
               </w:rPr>
-              <w:t>Email receipt header</w:t>
+              <w:t>Email receipt</w:t>
             </w:r>
           </w:p>
         </w:tc>
@@ -11937,7 +11937,7 @@
                 <w:rFonts w:ascii="Arial" w:hAnsi="Arial"/>
                 <w:sz w:val="18"/>
               </w:rPr>
-              <w:t>receipt-rh.png — 600×200 px</w:t>
+              <w:t>(empty)</w:t>
             </w:r>
           </w:p>
         </w:tc>
@@ -11951,7 +11951,7 @@
           <w:color w:val="0F1117"/>
           <w:sz w:val="22"/>
         </w:rPr>
-        <w:t>Confirmation Modal (Thank You Page)</w:t>
+        <w:t>Confirmation modal</w:t>
       </w:r>
     </w:p>
     <w:tbl>
@@ -12020,7 +12020,7 @@
                 <w:b/>
                 <w:sz w:val="18"/>
               </w:rPr>
-              <w:t>Image</w:t>
+              <w:t>(image — set in LS)</w:t>
             </w:r>
           </w:p>
         </w:tc>
@@ -12035,7 +12035,7 @@
                 <w:rFonts w:ascii="Arial" w:hAnsi="Arial"/>
                 <w:sz w:val="18"/>
               </w:rPr>
-              <w:t>confirmation-rh.png</w:t>
+              <w:t>(set in LS UI)</w:t>
             </w:r>
           </w:p>
         </w:tc>
@@ -12094,7 +12094,7 @@
                 <w:b/>
                 <w:sz w:val="18"/>
               </w:rPr>
-              <w:t>Subtitle</w:t>
+              <w:t>Message</w:t>
             </w:r>
           </w:p>
         </w:tc>
@@ -12109,7 +12109,7 @@
                 <w:rFonts w:ascii="Arial" w:hAnsi="Arial"/>
                 <w:sz w:val="18"/>
               </w:rPr>
-              <w:t>Your 7-day free trial starts now.</w:t>
+              <w:t>Thank you for subscribing to The Prompt Studio. Your 7-day free trial is now active. Sign in at https://theprompt.studio to access your tools.</w:t>
             </w:r>
           </w:p>
         </w:tc>
@@ -12131,7 +12131,7 @@
                 <w:b/>
                 <w:sz w:val="18"/>
               </w:rPr>
-              <w:t>Button / Redirect</w:t>
+              <w:t>Button link</w:t>
             </w:r>
           </w:p>
         </w:tc>
@@ -12146,7 +12146,7 @@
                 <w:rFonts w:ascii="Arial" w:hAnsi="Arial"/>
                 <w:sz w:val="18"/>
               </w:rPr>
-              <w:t>https://theprompt.studio/dashboard.html?welcome=1</w:t>
+              <w:t>theprompt.studio/dashboard.html?welcome=1</w:t>
             </w:r>
           </w:p>
         </w:tc>
@@ -12168,7 +12168,7 @@
                 <w:b/>
                 <w:sz w:val="18"/>
               </w:rPr>
-              <w:t>Additional message</w:t>
+              <w:t>Button text</w:t>
             </w:r>
           </w:p>
         </w:tc>
@@ -12183,7 +12183,7 @@
                 <w:rFonts w:ascii="Arial" w:hAnsi="Arial"/>
                 <w:sz w:val="18"/>
               </w:rPr>
-              <w:t>Sign in with your credentials to access your AI tools.</w:t>
+              <w:t>View Order</w:t>
             </w:r>
           </w:p>
         </w:tc>
@@ -12266,7 +12266,7 @@
                 <w:b/>
                 <w:sz w:val="18"/>
               </w:rPr>
-              <w:t>Header image</w:t>
+              <w:t>Thank you note</w:t>
             </w:r>
           </w:p>
         </w:tc>
@@ -12281,7 +12281,7 @@
                 <w:rFonts w:ascii="Arial" w:hAnsi="Arial"/>
                 <w:sz w:val="18"/>
               </w:rPr>
-              <w:t>receipt-rh.png — 600×200 px</w:t>
+              <w:t>(empty)</w:t>
             </w:r>
           </w:p>
         </w:tc>
@@ -12303,7 +12303,7 @@
                 <w:b/>
                 <w:sz w:val="18"/>
               </w:rPr>
-              <w:t>Email subject</w:t>
+              <w:t>Button text</w:t>
             </w:r>
           </w:p>
         </w:tc>
@@ -12318,7 +12318,7 @@
                 <w:rFonts w:ascii="Arial" w:hAnsi="Arial"/>
                 <w:sz w:val="18"/>
               </w:rPr>
-              <w:t>Your subscription — AI Toolkit Human Resources</w:t>
+              <w:t>View Order</w:t>
             </w:r>
           </w:p>
         </w:tc>
@@ -12340,7 +12340,7 @@
                 <w:b/>
                 <w:sz w:val="18"/>
               </w:rPr>
-              <w:t>Custom text</w:t>
+              <w:t>Button link</w:t>
             </w:r>
           </w:p>
         </w:tc>
@@ -12355,7 +12355,7 @@
                 <w:rFonts w:ascii="Arial" w:hAnsi="Arial"/>
                 <w:sz w:val="18"/>
               </w:rPr>
-              <w:t>Thank you for subscribing to the AI Toolkit Human Resources on The Prompt Studio. Your 7-day free trial is now active. Sign in at https://theprompt.studio to access your tools.</w:t>
+              <w:t>app.lemonsqueezy.com/my-orders</w:t>
             </w:r>
           </w:p>
         </w:tc>
@@ -12377,7 +12377,7 @@
                 <w:b/>
                 <w:sz w:val="18"/>
               </w:rPr>
-              <w:t>Footer</w:t>
+              <w:t>(footer — auto by LS)</w:t>
             </w:r>
           </w:p>
         </w:tc>
@@ -12392,7 +12392,7 @@
                 <w:rFonts w:ascii="Arial" w:hAnsi="Arial"/>
                 <w:sz w:val="18"/>
               </w:rPr>
-              <w:t>The Prompt Studio — theprompt.studio — support@theprompt.studio</w:t>
+              <w:t>(auto by LS)</w:t>
             </w:r>
           </w:p>
         </w:tc>
@@ -13721,7 +13721,7 @@
                 <w:b/>
                 <w:sz w:val="18"/>
               </w:rPr>
-              <w:t>Confirmation image (Thank You)</w:t>
+              <w:t>Confirmation modal</w:t>
             </w:r>
           </w:p>
         </w:tc>
@@ -13736,7 +13736,7 @@
                 <w:rFonts w:ascii="Arial" w:hAnsi="Arial"/>
                 <w:sz w:val="18"/>
               </w:rPr>
-              <w:t>confirmation-sante.png — 1600×1200 px</w:t>
+              <w:t>(see Confirmation modal section)</w:t>
             </w:r>
           </w:p>
         </w:tc>
@@ -13758,7 +13758,7 @@
                 <w:b/>
                 <w:sz w:val="18"/>
               </w:rPr>
-              <w:t>Email receipt header</w:t>
+              <w:t>Email receipt</w:t>
             </w:r>
           </w:p>
         </w:tc>
@@ -13773,7 +13773,7 @@
                 <w:rFonts w:ascii="Arial" w:hAnsi="Arial"/>
                 <w:sz w:val="18"/>
               </w:rPr>
-              <w:t>receipt-sante.png — 600×200 px</w:t>
+              <w:t>(empty)</w:t>
             </w:r>
           </w:p>
         </w:tc>
@@ -13787,7 +13787,7 @@
           <w:color w:val="0F1117"/>
           <w:sz w:val="22"/>
         </w:rPr>
-        <w:t>Confirmation Modal (Thank You Page)</w:t>
+        <w:t>Confirmation modal</w:t>
       </w:r>
     </w:p>
     <w:tbl>
@@ -13856,7 +13856,7 @@
                 <w:b/>
                 <w:sz w:val="18"/>
               </w:rPr>
-              <w:t>Image</w:t>
+              <w:t>(image — set in LS)</w:t>
             </w:r>
           </w:p>
         </w:tc>
@@ -13871,7 +13871,7 @@
                 <w:rFonts w:ascii="Arial" w:hAnsi="Arial"/>
                 <w:sz w:val="18"/>
               </w:rPr>
-              <w:t>confirmation-sante.png</w:t>
+              <w:t>(set in LS UI)</w:t>
             </w:r>
           </w:p>
         </w:tc>
@@ -13930,7 +13930,7 @@
                 <w:b/>
                 <w:sz w:val="18"/>
               </w:rPr>
-              <w:t>Subtitle</w:t>
+              <w:t>Message</w:t>
             </w:r>
           </w:p>
         </w:tc>
@@ -13945,7 +13945,7 @@
                 <w:rFonts w:ascii="Arial" w:hAnsi="Arial"/>
                 <w:sz w:val="18"/>
               </w:rPr>
-              <w:t>Your 7-day free trial starts now.</w:t>
+              <w:t>Thank you for subscribing to The Prompt Studio. Your 7-day free trial is now active. Sign in at https://theprompt.studio to access your tools.</w:t>
             </w:r>
           </w:p>
         </w:tc>
@@ -13967,7 +13967,7 @@
                 <w:b/>
                 <w:sz w:val="18"/>
               </w:rPr>
-              <w:t>Button / Redirect</w:t>
+              <w:t>Button link</w:t>
             </w:r>
           </w:p>
         </w:tc>
@@ -13982,7 +13982,7 @@
                 <w:rFonts w:ascii="Arial" w:hAnsi="Arial"/>
                 <w:sz w:val="18"/>
               </w:rPr>
-              <w:t>https://theprompt.studio/dashboard.html?welcome=1</w:t>
+              <w:t>theprompt.studio/dashboard.html?welcome=1</w:t>
             </w:r>
           </w:p>
         </w:tc>
@@ -14004,7 +14004,7 @@
                 <w:b/>
                 <w:sz w:val="18"/>
               </w:rPr>
-              <w:t>Additional message</w:t>
+              <w:t>Button text</w:t>
             </w:r>
           </w:p>
         </w:tc>
@@ -14019,7 +14019,7 @@
                 <w:rFonts w:ascii="Arial" w:hAnsi="Arial"/>
                 <w:sz w:val="18"/>
               </w:rPr>
-              <w:t>Sign in with your credentials to access your AI tools.</w:t>
+              <w:t>View Order</w:t>
             </w:r>
           </w:p>
         </w:tc>
@@ -14102,7 +14102,7 @@
                 <w:b/>
                 <w:sz w:val="18"/>
               </w:rPr>
-              <w:t>Header image</w:t>
+              <w:t>Thank you note</w:t>
             </w:r>
           </w:p>
         </w:tc>
@@ -14117,7 +14117,7 @@
                 <w:rFonts w:ascii="Arial" w:hAnsi="Arial"/>
                 <w:sz w:val="18"/>
               </w:rPr>
-              <w:t>receipt-sante.png — 600×200 px</w:t>
+              <w:t>(empty)</w:t>
             </w:r>
           </w:p>
         </w:tc>
@@ -14139,7 +14139,7 @@
                 <w:b/>
                 <w:sz w:val="18"/>
               </w:rPr>
-              <w:t>Email subject</w:t>
+              <w:t>Button text</w:t>
             </w:r>
           </w:p>
         </w:tc>
@@ -14154,7 +14154,7 @@
                 <w:rFonts w:ascii="Arial" w:hAnsi="Arial"/>
                 <w:sz w:val="18"/>
               </w:rPr>
-              <w:t>Your subscription — AI Toolkit Health &amp; Wellness</w:t>
+              <w:t>View Order</w:t>
             </w:r>
           </w:p>
         </w:tc>
@@ -14176,7 +14176,7 @@
                 <w:b/>
                 <w:sz w:val="18"/>
               </w:rPr>
-              <w:t>Custom text</w:t>
+              <w:t>Button link</w:t>
             </w:r>
           </w:p>
         </w:tc>
@@ -14191,7 +14191,7 @@
                 <w:rFonts w:ascii="Arial" w:hAnsi="Arial"/>
                 <w:sz w:val="18"/>
               </w:rPr>
-              <w:t>Thank you for subscribing to the AI Toolkit Health &amp; Wellness on The Prompt Studio. Your 7-day free trial is now active. Sign in at https://theprompt.studio to access your tools.</w:t>
+              <w:t>app.lemonsqueezy.com/my-orders</w:t>
             </w:r>
           </w:p>
         </w:tc>
@@ -14213,7 +14213,7 @@
                 <w:b/>
                 <w:sz w:val="18"/>
               </w:rPr>
-              <w:t>Footer</w:t>
+              <w:t>(footer — auto by LS)</w:t>
             </w:r>
           </w:p>
         </w:tc>
@@ -14228,7 +14228,7 @@
                 <w:rFonts w:ascii="Arial" w:hAnsi="Arial"/>
                 <w:sz w:val="18"/>
               </w:rPr>
-              <w:t>The Prompt Studio — theprompt.studio — support@theprompt.studio</w:t>
+              <w:t>(auto by LS)</w:t>
             </w:r>
           </w:p>
         </w:tc>
@@ -15557,7 +15557,7 @@
                 <w:b/>
                 <w:sz w:val="18"/>
               </w:rPr>
-              <w:t>Confirmation image (Thank You)</w:t>
+              <w:t>Confirmation modal</w:t>
             </w:r>
           </w:p>
         </w:tc>
@@ -15572,7 +15572,7 @@
                 <w:rFonts w:ascii="Arial" w:hAnsi="Arial"/>
                 <w:sz w:val="18"/>
               </w:rPr>
-              <w:t>confirmation-education.png — 1600×1200 px</w:t>
+              <w:t>(see Confirmation modal section)</w:t>
             </w:r>
           </w:p>
         </w:tc>
@@ -15594,7 +15594,7 @@
                 <w:b/>
                 <w:sz w:val="18"/>
               </w:rPr>
-              <w:t>Email receipt header</w:t>
+              <w:t>Email receipt</w:t>
             </w:r>
           </w:p>
         </w:tc>
@@ -15609,7 +15609,7 @@
                 <w:rFonts w:ascii="Arial" w:hAnsi="Arial"/>
                 <w:sz w:val="18"/>
               </w:rPr>
-              <w:t>receipt-education.png — 600×200 px</w:t>
+              <w:t>(empty)</w:t>
             </w:r>
           </w:p>
         </w:tc>
@@ -15623,7 +15623,7 @@
           <w:color w:val="0F1117"/>
           <w:sz w:val="22"/>
         </w:rPr>
-        <w:t>Confirmation Modal (Thank You Page)</w:t>
+        <w:t>Confirmation modal</w:t>
       </w:r>
     </w:p>
     <w:tbl>
@@ -15692,7 +15692,7 @@
                 <w:b/>
                 <w:sz w:val="18"/>
               </w:rPr>
-              <w:t>Image</w:t>
+              <w:t>(image — set in LS)</w:t>
             </w:r>
           </w:p>
         </w:tc>
@@ -15707,7 +15707,7 @@
                 <w:rFonts w:ascii="Arial" w:hAnsi="Arial"/>
                 <w:sz w:val="18"/>
               </w:rPr>
-              <w:t>confirmation-education.png</w:t>
+              <w:t>(set in LS UI)</w:t>
             </w:r>
           </w:p>
         </w:tc>
@@ -15766,7 +15766,7 @@
                 <w:b/>
                 <w:sz w:val="18"/>
               </w:rPr>
-              <w:t>Subtitle</w:t>
+              <w:t>Message</w:t>
             </w:r>
           </w:p>
         </w:tc>
@@ -15781,7 +15781,7 @@
                 <w:rFonts w:ascii="Arial" w:hAnsi="Arial"/>
                 <w:sz w:val="18"/>
               </w:rPr>
-              <w:t>Your 7-day free trial starts now.</w:t>
+              <w:t>Thank you for subscribing to The Prompt Studio. Your 7-day free trial is now active. Sign in at https://theprompt.studio to access your tools.</w:t>
             </w:r>
           </w:p>
         </w:tc>
@@ -15803,7 +15803,7 @@
                 <w:b/>
                 <w:sz w:val="18"/>
               </w:rPr>
-              <w:t>Button / Redirect</w:t>
+              <w:t>Button link</w:t>
             </w:r>
           </w:p>
         </w:tc>
@@ -15818,7 +15818,7 @@
                 <w:rFonts w:ascii="Arial" w:hAnsi="Arial"/>
                 <w:sz w:val="18"/>
               </w:rPr>
-              <w:t>https://theprompt.studio/dashboard.html?welcome=1</w:t>
+              <w:t>theprompt.studio/dashboard.html?welcome=1</w:t>
             </w:r>
           </w:p>
         </w:tc>
@@ -15840,7 +15840,7 @@
                 <w:b/>
                 <w:sz w:val="18"/>
               </w:rPr>
-              <w:t>Additional message</w:t>
+              <w:t>Button text</w:t>
             </w:r>
           </w:p>
         </w:tc>
@@ -15855,7 +15855,7 @@
                 <w:rFonts w:ascii="Arial" w:hAnsi="Arial"/>
                 <w:sz w:val="18"/>
               </w:rPr>
-              <w:t>Sign in with your credentials to access your AI tools.</w:t>
+              <w:t>View Order</w:t>
             </w:r>
           </w:p>
         </w:tc>
@@ -15938,7 +15938,7 @@
                 <w:b/>
                 <w:sz w:val="18"/>
               </w:rPr>
-              <w:t>Header image</w:t>
+              <w:t>Thank you note</w:t>
             </w:r>
           </w:p>
         </w:tc>
@@ -15953,7 +15953,7 @@
                 <w:rFonts w:ascii="Arial" w:hAnsi="Arial"/>
                 <w:sz w:val="18"/>
               </w:rPr>
-              <w:t>receipt-education.png — 600×200 px</w:t>
+              <w:t>(empty)</w:t>
             </w:r>
           </w:p>
         </w:tc>
@@ -15975,7 +15975,7 @@
                 <w:b/>
                 <w:sz w:val="18"/>
               </w:rPr>
-              <w:t>Email subject</w:t>
+              <w:t>Button text</w:t>
             </w:r>
           </w:p>
         </w:tc>
@@ -15990,7 +15990,7 @@
                 <w:rFonts w:ascii="Arial" w:hAnsi="Arial"/>
                 <w:sz w:val="18"/>
               </w:rPr>
-              <w:t>Your subscription — AI Toolkit Education &amp; Training</w:t>
+              <w:t>View Order</w:t>
             </w:r>
           </w:p>
         </w:tc>
@@ -16012,7 +16012,7 @@
                 <w:b/>
                 <w:sz w:val="18"/>
               </w:rPr>
-              <w:t>Custom text</w:t>
+              <w:t>Button link</w:t>
             </w:r>
           </w:p>
         </w:tc>
@@ -16027,7 +16027,7 @@
                 <w:rFonts w:ascii="Arial" w:hAnsi="Arial"/>
                 <w:sz w:val="18"/>
               </w:rPr>
-              <w:t>Thank you for subscribing to the AI Toolkit Education &amp; Training on The Prompt Studio. Your 7-day free trial is now active. Sign in at https://theprompt.studio to access your tools.</w:t>
+              <w:t>app.lemonsqueezy.com/my-orders</w:t>
             </w:r>
           </w:p>
         </w:tc>
@@ -16049,7 +16049,7 @@
                 <w:b/>
                 <w:sz w:val="18"/>
               </w:rPr>
-              <w:t>Footer</w:t>
+              <w:t>(footer — auto by LS)</w:t>
             </w:r>
           </w:p>
         </w:tc>
@@ -16064,7 +16064,7 @@
                 <w:rFonts w:ascii="Arial" w:hAnsi="Arial"/>
                 <w:sz w:val="18"/>
               </w:rPr>
-              <w:t>The Prompt Studio — theprompt.studio — support@theprompt.studio</w:t>
+              <w:t>(auto by LS)</w:t>
             </w:r>
           </w:p>
         </w:tc>
@@ -17393,7 +17393,7 @@
                 <w:b/>
                 <w:sz w:val="18"/>
               </w:rPr>
-              <w:t>Confirmation image (Thank You)</w:t>
+              <w:t>Confirmation modal</w:t>
             </w:r>
           </w:p>
         </w:tc>
@@ -17408,7 +17408,7 @@
                 <w:rFonts w:ascii="Arial" w:hAnsi="Arial"/>
                 <w:sz w:val="18"/>
               </w:rPr>
-              <w:t>confirmation-restauration.png — 1600×1200 px</w:t>
+              <w:t>(see Confirmation modal section)</w:t>
             </w:r>
           </w:p>
         </w:tc>
@@ -17430,7 +17430,7 @@
                 <w:b/>
                 <w:sz w:val="18"/>
               </w:rPr>
-              <w:t>Email receipt header</w:t>
+              <w:t>Email receipt</w:t>
             </w:r>
           </w:p>
         </w:tc>
@@ -17445,7 +17445,7 @@
                 <w:rFonts w:ascii="Arial" w:hAnsi="Arial"/>
                 <w:sz w:val="18"/>
               </w:rPr>
-              <w:t>receipt-restauration.png — 600×200 px</w:t>
+              <w:t>(empty)</w:t>
             </w:r>
           </w:p>
         </w:tc>
@@ -17459,7 +17459,7 @@
           <w:color w:val="0F1117"/>
           <w:sz w:val="22"/>
         </w:rPr>
-        <w:t>Confirmation Modal (Thank You Page)</w:t>
+        <w:t>Confirmation modal</w:t>
       </w:r>
     </w:p>
     <w:tbl>
@@ -17528,7 +17528,7 @@
                 <w:b/>
                 <w:sz w:val="18"/>
               </w:rPr>
-              <w:t>Image</w:t>
+              <w:t>(image — set in LS)</w:t>
             </w:r>
           </w:p>
         </w:tc>
@@ -17543,7 +17543,7 @@
                 <w:rFonts w:ascii="Arial" w:hAnsi="Arial"/>
                 <w:sz w:val="18"/>
               </w:rPr>
-              <w:t>confirmation-restauration.png</w:t>
+              <w:t>(set in LS UI)</w:t>
             </w:r>
           </w:p>
         </w:tc>
@@ -17602,7 +17602,7 @@
                 <w:b/>
                 <w:sz w:val="18"/>
               </w:rPr>
-              <w:t>Subtitle</w:t>
+              <w:t>Message</w:t>
             </w:r>
           </w:p>
         </w:tc>
@@ -17617,7 +17617,7 @@
                 <w:rFonts w:ascii="Arial" w:hAnsi="Arial"/>
                 <w:sz w:val="18"/>
               </w:rPr>
-              <w:t>Your 7-day free trial starts now.</w:t>
+              <w:t>Thank you for subscribing to The Prompt Studio. Your 7-day free trial is now active. Sign in at https://theprompt.studio to access your tools.</w:t>
             </w:r>
           </w:p>
         </w:tc>
@@ -17639,7 +17639,7 @@
                 <w:b/>
                 <w:sz w:val="18"/>
               </w:rPr>
-              <w:t>Button / Redirect</w:t>
+              <w:t>Button link</w:t>
             </w:r>
           </w:p>
         </w:tc>
@@ -17654,7 +17654,7 @@
                 <w:rFonts w:ascii="Arial" w:hAnsi="Arial"/>
                 <w:sz w:val="18"/>
               </w:rPr>
-              <w:t>https://theprompt.studio/dashboard.html?welcome=1</w:t>
+              <w:t>theprompt.studio/dashboard.html?welcome=1</w:t>
             </w:r>
           </w:p>
         </w:tc>
@@ -17676,7 +17676,7 @@
                 <w:b/>
                 <w:sz w:val="18"/>
               </w:rPr>
-              <w:t>Additional message</w:t>
+              <w:t>Button text</w:t>
             </w:r>
           </w:p>
         </w:tc>
@@ -17691,7 +17691,7 @@
                 <w:rFonts w:ascii="Arial" w:hAnsi="Arial"/>
                 <w:sz w:val="18"/>
               </w:rPr>
-              <w:t>Sign in with your credentials to access your AI tools.</w:t>
+              <w:t>View Order</w:t>
             </w:r>
           </w:p>
         </w:tc>
@@ -17774,7 +17774,7 @@
                 <w:b/>
                 <w:sz w:val="18"/>
               </w:rPr>
-              <w:t>Header image</w:t>
+              <w:t>Thank you note</w:t>
             </w:r>
           </w:p>
         </w:tc>
@@ -17789,7 +17789,7 @@
                 <w:rFonts w:ascii="Arial" w:hAnsi="Arial"/>
                 <w:sz w:val="18"/>
               </w:rPr>
-              <w:t>receipt-restauration.png — 600×200 px</w:t>
+              <w:t>(empty)</w:t>
             </w:r>
           </w:p>
         </w:tc>
@@ -17811,7 +17811,7 @@
                 <w:b/>
                 <w:sz w:val="18"/>
               </w:rPr>
-              <w:t>Email subject</w:t>
+              <w:t>Button text</w:t>
             </w:r>
           </w:p>
         </w:tc>
@@ -17826,7 +17826,7 @@
                 <w:rFonts w:ascii="Arial" w:hAnsi="Arial"/>
                 <w:sz w:val="18"/>
               </w:rPr>
-              <w:t>Your subscription — AI Toolkit Food &amp; Hospitality</w:t>
+              <w:t>View Order</w:t>
             </w:r>
           </w:p>
         </w:tc>
@@ -17848,7 +17848,7 @@
                 <w:b/>
                 <w:sz w:val="18"/>
               </w:rPr>
-              <w:t>Custom text</w:t>
+              <w:t>Button link</w:t>
             </w:r>
           </w:p>
         </w:tc>
@@ -17863,7 +17863,7 @@
                 <w:rFonts w:ascii="Arial" w:hAnsi="Arial"/>
                 <w:sz w:val="18"/>
               </w:rPr>
-              <w:t>Thank you for subscribing to the AI Toolkit Food &amp; Hospitality on The Prompt Studio. Your 7-day free trial is now active. Sign in at https://theprompt.studio to access your tools.</w:t>
+              <w:t>app.lemonsqueezy.com/my-orders</w:t>
             </w:r>
           </w:p>
         </w:tc>
@@ -17885,7 +17885,7 @@
                 <w:b/>
                 <w:sz w:val="18"/>
               </w:rPr>
-              <w:t>Footer</w:t>
+              <w:t>(footer — auto by LS)</w:t>
             </w:r>
           </w:p>
         </w:tc>
@@ -17900,7 +17900,7 @@
                 <w:rFonts w:ascii="Arial" w:hAnsi="Arial"/>
                 <w:sz w:val="18"/>
               </w:rPr>
-              <w:t>The Prompt Studio — theprompt.studio — support@theprompt.studio</w:t>
+              <w:t>(auto by LS)</w:t>
             </w:r>
           </w:p>
         </w:tc>
@@ -19229,7 +19229,7 @@
                 <w:b/>
                 <w:sz w:val="18"/>
               </w:rPr>
-              <w:t>Confirmation image (Thank You)</w:t>
+              <w:t>Confirmation modal</w:t>
             </w:r>
           </w:p>
         </w:tc>
@@ -19244,7 +19244,7 @@
                 <w:rFonts w:ascii="Arial" w:hAnsi="Arial"/>
                 <w:sz w:val="18"/>
               </w:rPr>
-              <w:t>confirmation-freelance.png — 1600×1200 px</w:t>
+              <w:t>(see Confirmation modal section)</w:t>
             </w:r>
           </w:p>
         </w:tc>
@@ -19266,7 +19266,7 @@
                 <w:b/>
                 <w:sz w:val="18"/>
               </w:rPr>
-              <w:t>Email receipt header</w:t>
+              <w:t>Email receipt</w:t>
             </w:r>
           </w:p>
         </w:tc>
@@ -19281,7 +19281,7 @@
                 <w:rFonts w:ascii="Arial" w:hAnsi="Arial"/>
                 <w:sz w:val="18"/>
               </w:rPr>
-              <w:t>receipt-freelance.png — 600×200 px</w:t>
+              <w:t>(empty)</w:t>
             </w:r>
           </w:p>
         </w:tc>
@@ -19295,7 +19295,7 @@
           <w:color w:val="0F1117"/>
           <w:sz w:val="22"/>
         </w:rPr>
-        <w:t>Confirmation Modal (Thank You Page)</w:t>
+        <w:t>Confirmation modal</w:t>
       </w:r>
     </w:p>
     <w:tbl>
@@ -19364,7 +19364,7 @@
                 <w:b/>
                 <w:sz w:val="18"/>
               </w:rPr>
-              <w:t>Image</w:t>
+              <w:t>(image — set in LS)</w:t>
             </w:r>
           </w:p>
         </w:tc>
@@ -19379,7 +19379,7 @@
                 <w:rFonts w:ascii="Arial" w:hAnsi="Arial"/>
                 <w:sz w:val="18"/>
               </w:rPr>
-              <w:t>confirmation-freelance.png</w:t>
+              <w:t>(set in LS UI)</w:t>
             </w:r>
           </w:p>
         </w:tc>
@@ -19438,7 +19438,7 @@
                 <w:b/>
                 <w:sz w:val="18"/>
               </w:rPr>
-              <w:t>Subtitle</w:t>
+              <w:t>Message</w:t>
             </w:r>
           </w:p>
         </w:tc>
@@ -19453,7 +19453,7 @@
                 <w:rFonts w:ascii="Arial" w:hAnsi="Arial"/>
                 <w:sz w:val="18"/>
               </w:rPr>
-              <w:t>Your 7-day free trial starts now.</w:t>
+              <w:t>Thank you for subscribing to The Prompt Studio. Your 7-day free trial is now active. Sign in at https://theprompt.studio to access your tools.</w:t>
             </w:r>
           </w:p>
         </w:tc>
@@ -19475,7 +19475,7 @@
                 <w:b/>
                 <w:sz w:val="18"/>
               </w:rPr>
-              <w:t>Button / Redirect</w:t>
+              <w:t>Button link</w:t>
             </w:r>
           </w:p>
         </w:tc>
@@ -19490,7 +19490,7 @@
                 <w:rFonts w:ascii="Arial" w:hAnsi="Arial"/>
                 <w:sz w:val="18"/>
               </w:rPr>
-              <w:t>https://theprompt.studio/dashboard.html?welcome=1</w:t>
+              <w:t>theprompt.studio/dashboard.html?welcome=1</w:t>
             </w:r>
           </w:p>
         </w:tc>
@@ -19512,7 +19512,7 @@
                 <w:b/>
                 <w:sz w:val="18"/>
               </w:rPr>
-              <w:t>Additional message</w:t>
+              <w:t>Button text</w:t>
             </w:r>
           </w:p>
         </w:tc>
@@ -19527,7 +19527,7 @@
                 <w:rFonts w:ascii="Arial" w:hAnsi="Arial"/>
                 <w:sz w:val="18"/>
               </w:rPr>
-              <w:t>Sign in with your credentials to access your AI tools.</w:t>
+              <w:t>View Order</w:t>
             </w:r>
           </w:p>
         </w:tc>
@@ -19610,7 +19610,7 @@
                 <w:b/>
                 <w:sz w:val="18"/>
               </w:rPr>
-              <w:t>Header image</w:t>
+              <w:t>Thank you note</w:t>
             </w:r>
           </w:p>
         </w:tc>
@@ -19625,7 +19625,7 @@
                 <w:rFonts w:ascii="Arial" w:hAnsi="Arial"/>
                 <w:sz w:val="18"/>
               </w:rPr>
-              <w:t>receipt-freelance.png — 600×200 px</w:t>
+              <w:t>(empty)</w:t>
             </w:r>
           </w:p>
         </w:tc>
@@ -19647,7 +19647,7 @@
                 <w:b/>
                 <w:sz w:val="18"/>
               </w:rPr>
-              <w:t>Email subject</w:t>
+              <w:t>Button text</w:t>
             </w:r>
           </w:p>
         </w:tc>
@@ -19662,7 +19662,7 @@
                 <w:rFonts w:ascii="Arial" w:hAnsi="Arial"/>
                 <w:sz w:val="18"/>
               </w:rPr>
-              <w:t>Your subscription — AI Toolkit Freelancers &amp; Consultants</w:t>
+              <w:t>View Order</w:t>
             </w:r>
           </w:p>
         </w:tc>
@@ -19684,7 +19684,7 @@
                 <w:b/>
                 <w:sz w:val="18"/>
               </w:rPr>
-              <w:t>Custom text</w:t>
+              <w:t>Button link</w:t>
             </w:r>
           </w:p>
         </w:tc>
@@ -19699,7 +19699,7 @@
                 <w:rFonts w:ascii="Arial" w:hAnsi="Arial"/>
                 <w:sz w:val="18"/>
               </w:rPr>
-              <w:t>Thank you for subscribing to the AI Toolkit Freelancers &amp; Consultants on The Prompt Studio. Your 7-day free trial is now active. Sign in at https://theprompt.studio to access your tools.</w:t>
+              <w:t>app.lemonsqueezy.com/my-orders</w:t>
             </w:r>
           </w:p>
         </w:tc>
@@ -19721,7 +19721,7 @@
                 <w:b/>
                 <w:sz w:val="18"/>
               </w:rPr>
-              <w:t>Footer</w:t>
+              <w:t>(footer — auto by LS)</w:t>
             </w:r>
           </w:p>
         </w:tc>
@@ -19736,7 +19736,7 @@
                 <w:rFonts w:ascii="Arial" w:hAnsi="Arial"/>
                 <w:sz w:val="18"/>
               </w:rPr>
-              <w:t>The Prompt Studio — theprompt.studio — support@theprompt.studio</w:t>
+              <w:t>(auto by LS)</w:t>
             </w:r>
           </w:p>
         </w:tc>
@@ -29802,7 +29802,7 @@
         <w:pStyle w:val="Heading1"/>
       </w:pPr>
       <w:r>
-        <w:t>5. Confirmation Modal (Thank You Page)</w:t>
+        <w:t>5. Confirmation modal</w:t>
       </w:r>
     </w:p>
     <w:p>
@@ -29810,7 +29810,7 @@
         <w:rPr>
           <w:sz w:val="20"/>
         </w:rPr>
-        <w:t>Configure in Products &gt; [Product] &gt; Confirmation. The post-purchase overlay shows the image and redirects to the dashboard.</w:t>
+        <w:t>Configure in Products &gt; [Product] &gt; Confirmation modal. Fields: Title, Message, Button text, Button link.</w:t>
       </w:r>
     </w:p>
     <w:p/>
@@ -29860,7 +29860,7 @@
                 <w:color w:val="0F1117"/>
                 <w:sz w:val="18"/>
               </w:rPr>
-              <w:t>Confirmation image</w:t>
+              <w:t>Message</w:t>
             </w:r>
           </w:p>
         </w:tc>
@@ -29896,7 +29896,7 @@
                 <w:color w:val="0F1117"/>
                 <w:sz w:val="18"/>
               </w:rPr>
-              <w:t>Redirect URL</w:t>
+              <w:t>Button link</w:t>
             </w:r>
           </w:p>
         </w:tc>
@@ -29928,7 +29928,7 @@
                 <w:rFonts w:ascii="Arial" w:hAnsi="Arial"/>
                 <w:sz w:val="18"/>
               </w:rPr>
-              <w:t>confirmation-immo.png</w:t>
+              <w:t>(set in LS UI)</w:t>
             </w:r>
           </w:p>
         </w:tc>
@@ -29958,7 +29958,7 @@
                 <w:rFonts w:ascii="Arial" w:hAnsi="Arial"/>
                 <w:sz w:val="18"/>
               </w:rPr>
-              <w:t>https://theprompt.studio/dashboard.html?welcome=1</w:t>
+              <w:t>theprompt.studio/dashboard.html?welcome=1</w:t>
             </w:r>
           </w:p>
         </w:tc>
@@ -29990,7 +29990,7 @@
                 <w:rFonts w:ascii="Arial" w:hAnsi="Arial"/>
                 <w:sz w:val="18"/>
               </w:rPr>
-              <w:t>confirmation-commerce.png</w:t>
+              <w:t>(set in LS UI)</w:t>
             </w:r>
           </w:p>
         </w:tc>
@@ -30020,7 +30020,7 @@
                 <w:rFonts w:ascii="Arial" w:hAnsi="Arial"/>
                 <w:sz w:val="18"/>
               </w:rPr>
-              <w:t>https://theprompt.studio/dashboard.html?welcome=1</w:t>
+              <w:t>theprompt.studio/dashboard.html?welcome=1</w:t>
             </w:r>
           </w:p>
         </w:tc>
@@ -30052,7 +30052,7 @@
                 <w:rFonts w:ascii="Arial" w:hAnsi="Arial"/>
                 <w:sz w:val="18"/>
               </w:rPr>
-              <w:t>confirmation-legal.png</w:t>
+              <w:t>(set in LS UI)</w:t>
             </w:r>
           </w:p>
         </w:tc>
@@ -30082,7 +30082,7 @@
                 <w:rFonts w:ascii="Arial" w:hAnsi="Arial"/>
                 <w:sz w:val="18"/>
               </w:rPr>
-              <w:t>https://theprompt.studio/dashboard.html?welcome=1</w:t>
+              <w:t>theprompt.studio/dashboard.html?welcome=1</w:t>
             </w:r>
           </w:p>
         </w:tc>
@@ -30114,7 +30114,7 @@
                 <w:rFonts w:ascii="Arial" w:hAnsi="Arial"/>
                 <w:sz w:val="18"/>
               </w:rPr>
-              <w:t>confirmation-finance.png</w:t>
+              <w:t>(set in LS UI)</w:t>
             </w:r>
           </w:p>
         </w:tc>
@@ -30144,7 +30144,7 @@
                 <w:rFonts w:ascii="Arial" w:hAnsi="Arial"/>
                 <w:sz w:val="18"/>
               </w:rPr>
-              <w:t>https://theprompt.studio/dashboard.html?welcome=1</w:t>
+              <w:t>theprompt.studio/dashboard.html?welcome=1</w:t>
             </w:r>
           </w:p>
         </w:tc>
@@ -30176,7 +30176,7 @@
                 <w:rFonts w:ascii="Arial" w:hAnsi="Arial"/>
                 <w:sz w:val="18"/>
               </w:rPr>
-              <w:t>confirmation-marketing.png</w:t>
+              <w:t>(set in LS UI)</w:t>
             </w:r>
           </w:p>
         </w:tc>
@@ -30206,7 +30206,7 @@
                 <w:rFonts w:ascii="Arial" w:hAnsi="Arial"/>
                 <w:sz w:val="18"/>
               </w:rPr>
-              <w:t>https://theprompt.studio/dashboard.html?welcome=1</w:t>
+              <w:t>theprompt.studio/dashboard.html?welcome=1</w:t>
             </w:r>
           </w:p>
         </w:tc>
@@ -30238,7 +30238,7 @@
                 <w:rFonts w:ascii="Arial" w:hAnsi="Arial"/>
                 <w:sz w:val="18"/>
               </w:rPr>
-              <w:t>confirmation-rh.png</w:t>
+              <w:t>(set in LS UI)</w:t>
             </w:r>
           </w:p>
         </w:tc>
@@ -30268,7 +30268,7 @@
                 <w:rFonts w:ascii="Arial" w:hAnsi="Arial"/>
                 <w:sz w:val="18"/>
               </w:rPr>
-              <w:t>https://theprompt.studio/dashboard.html?welcome=1</w:t>
+              <w:t>theprompt.studio/dashboard.html?welcome=1</w:t>
             </w:r>
           </w:p>
         </w:tc>
@@ -30300,7 +30300,7 @@
                 <w:rFonts w:ascii="Arial" w:hAnsi="Arial"/>
                 <w:sz w:val="18"/>
               </w:rPr>
-              <w:t>confirmation-sante.png</w:t>
+              <w:t>(set in LS UI)</w:t>
             </w:r>
           </w:p>
         </w:tc>
@@ -30330,7 +30330,7 @@
                 <w:rFonts w:ascii="Arial" w:hAnsi="Arial"/>
                 <w:sz w:val="18"/>
               </w:rPr>
-              <w:t>https://theprompt.studio/dashboard.html?welcome=1</w:t>
+              <w:t>theprompt.studio/dashboard.html?welcome=1</w:t>
             </w:r>
           </w:p>
         </w:tc>
@@ -30362,7 +30362,7 @@
                 <w:rFonts w:ascii="Arial" w:hAnsi="Arial"/>
                 <w:sz w:val="18"/>
               </w:rPr>
-              <w:t>confirmation-education.png</w:t>
+              <w:t>(set in LS UI)</w:t>
             </w:r>
           </w:p>
         </w:tc>
@@ -30392,7 +30392,7 @@
                 <w:rFonts w:ascii="Arial" w:hAnsi="Arial"/>
                 <w:sz w:val="18"/>
               </w:rPr>
-              <w:t>https://theprompt.studio/dashboard.html?welcome=1</w:t>
+              <w:t>theprompt.studio/dashboard.html?welcome=1</w:t>
             </w:r>
           </w:p>
         </w:tc>
@@ -30424,7 +30424,7 @@
                 <w:rFonts w:ascii="Arial" w:hAnsi="Arial"/>
                 <w:sz w:val="18"/>
               </w:rPr>
-              <w:t>confirmation-restauration.png</w:t>
+              <w:t>(set in LS UI)</w:t>
             </w:r>
           </w:p>
         </w:tc>
@@ -30454,7 +30454,7 @@
                 <w:rFonts w:ascii="Arial" w:hAnsi="Arial"/>
                 <w:sz w:val="18"/>
               </w:rPr>
-              <w:t>https://theprompt.studio/dashboard.html?welcome=1</w:t>
+              <w:t>theprompt.studio/dashboard.html?welcome=1</w:t>
             </w:r>
           </w:p>
         </w:tc>
@@ -30486,7 +30486,7 @@
                 <w:rFonts w:ascii="Arial" w:hAnsi="Arial"/>
                 <w:sz w:val="18"/>
               </w:rPr>
-              <w:t>confirmation-freelance.png</w:t>
+              <w:t>(set in LS UI)</w:t>
             </w:r>
           </w:p>
         </w:tc>
@@ -30516,7 +30516,7 @@
                 <w:rFonts w:ascii="Arial" w:hAnsi="Arial"/>
                 <w:sz w:val="18"/>
               </w:rPr>
-              <w:t>https://theprompt.studio/dashboard.html?welcome=1</w:t>
+              <w:t>theprompt.studio/dashboard.html?welcome=1</w:t>
             </w:r>
           </w:p>
         </w:tc>
@@ -30598,7 +30598,7 @@
                 <w:b/>
                 <w:sz w:val="18"/>
               </w:rPr>
-              <w:t>Line 1</w:t>
+              <w:t>Message</w:t>
             </w:r>
           </w:p>
         </w:tc>
@@ -30613,7 +30613,7 @@
                 <w:rFonts w:ascii="Arial" w:hAnsi="Arial"/>
                 <w:sz w:val="18"/>
               </w:rPr>
-              <w:t>Your 7-day free trial starts now.</w:t>
+              <w:t>Thank you for subscribing to The Prompt Studio. Your 7-day free trial is now active. Sign in at https://theprompt.studio to access your tools.</w:t>
             </w:r>
           </w:p>
         </w:tc>
@@ -30635,7 +30635,7 @@
                 <w:b/>
                 <w:sz w:val="18"/>
               </w:rPr>
-              <w:t>Line 2</w:t>
+              <w:t>Button text</w:t>
             </w:r>
           </w:p>
         </w:tc>
@@ -30650,7 +30650,7 @@
                 <w:rFonts w:ascii="Arial" w:hAnsi="Arial"/>
                 <w:sz w:val="18"/>
               </w:rPr>
-              <w:t>Sign in with your credentials to access your AI tools.</w:t>
+              <w:t>View Order</w:t>
             </w:r>
           </w:p>
         </w:tc>
@@ -30672,7 +30672,7 @@
                 <w:b/>
                 <w:sz w:val="18"/>
               </w:rPr>
-              <w:t>CTA button</w:t>
+              <w:t>(not a LS field)</w:t>
             </w:r>
           </w:p>
         </w:tc>
@@ -30687,7 +30687,7 @@
                 <w:rFonts w:ascii="Arial" w:hAnsi="Arial"/>
                 <w:sz w:val="18"/>
               </w:rPr>
-              <w:t>Go to dashboard →</w:t>
+              <w:t>(not a LS field)</w:t>
             </w:r>
           </w:p>
         </w:tc>
@@ -30709,7 +30709,7 @@
                 <w:b/>
                 <w:sz w:val="18"/>
               </w:rPr>
-              <w:t>Button URL</w:t>
+              <w:t>Button link</w:t>
             </w:r>
           </w:p>
         </w:tc>
@@ -30724,7 +30724,7 @@
                 <w:rFonts w:ascii="Arial" w:hAnsi="Arial"/>
                 <w:sz w:val="18"/>
               </w:rPr>
-              <w:t>https://theprompt.studio/dashboard.html?welcome=1</w:t>
+              <w:t>theprompt.studio/dashboard.html?welcome=1</w:t>
             </w:r>
           </w:p>
         </w:tc>
@@ -30748,7 +30748,7 @@
         <w:rPr>
           <w:sz w:val="20"/>
         </w:rPr>
-        <w:t>Lemon Squeezy automatically sends a receipt email after each payment. Here are the elements to customize:</w:t>
+        <w:t>Configure in Products &gt; [Product] &gt; Email receipt. Fields: Thank you note, Button text, Button link.</w:t>
       </w:r>
     </w:p>
     <w:p/>
@@ -30758,7 +30758,7 @@
           <w:b/>
           <w:sz w:val="20"/>
         </w:rPr>
-        <w:t>Header image per vertical:</w:t>
+        <w:t>Email receipt settings per vertical:</w:t>
       </w:r>
     </w:p>
     <w:tbl>
@@ -30843,7 +30843,7 @@
                 <w:color w:val="0F1117"/>
                 <w:sz w:val="18"/>
               </w:rPr>
-              <w:t>Email subject</w:t>
+              <w:t>Button text</w:t>
             </w:r>
           </w:p>
         </w:tc>
@@ -30875,7 +30875,7 @@
                 <w:rFonts w:ascii="Arial" w:hAnsi="Arial"/>
                 <w:sz w:val="18"/>
               </w:rPr>
-              <w:t>receipt-immo.png</w:t>
+              <w:t>(empty)</w:t>
             </w:r>
           </w:p>
         </w:tc>
@@ -30890,7 +30890,7 @@
                 <w:rFonts w:ascii="Arial" w:hAnsi="Arial"/>
                 <w:sz w:val="18"/>
               </w:rPr>
-              <w:t>600 × 200 px</w:t>
+              <w:t>View Order</w:t>
             </w:r>
           </w:p>
         </w:tc>
@@ -30905,7 +30905,7 @@
                 <w:rFonts w:ascii="Arial" w:hAnsi="Arial"/>
                 <w:sz w:val="18"/>
               </w:rPr>
-              <w:t>Your subscription — AI Toolkit Real Estate</w:t>
+              <w:t>View Order</w:t>
             </w:r>
           </w:p>
         </w:tc>
@@ -30937,7 +30937,7 @@
                 <w:rFonts w:ascii="Arial" w:hAnsi="Arial"/>
                 <w:sz w:val="18"/>
               </w:rPr>
-              <w:t>receipt-commerce.png</w:t>
+              <w:t>(empty)</w:t>
             </w:r>
           </w:p>
         </w:tc>
@@ -30952,7 +30952,7 @@
                 <w:rFonts w:ascii="Arial" w:hAnsi="Arial"/>
                 <w:sz w:val="18"/>
               </w:rPr>
-              <w:t>600 × 200 px</w:t>
+              <w:t>View Order</w:t>
             </w:r>
           </w:p>
         </w:tc>
@@ -30967,7 +30967,7 @@
                 <w:rFonts w:ascii="Arial" w:hAnsi="Arial"/>
                 <w:sz w:val="18"/>
               </w:rPr>
-              <w:t>Your subscription — AI Toolkit E-Commerce &amp; Retail</w:t>
+              <w:t>View Order</w:t>
             </w:r>
           </w:p>
         </w:tc>
@@ -30999,7 +30999,7 @@
                 <w:rFonts w:ascii="Arial" w:hAnsi="Arial"/>
                 <w:sz w:val="18"/>
               </w:rPr>
-              <w:t>receipt-legal.png</w:t>
+              <w:t>(empty)</w:t>
             </w:r>
           </w:p>
         </w:tc>
@@ -31014,7 +31014,7 @@
                 <w:rFonts w:ascii="Arial" w:hAnsi="Arial"/>
                 <w:sz w:val="18"/>
               </w:rPr>
-              <w:t>600 × 200 px</w:t>
+              <w:t>View Order</w:t>
             </w:r>
           </w:p>
         </w:tc>
@@ -31029,7 +31029,7 @@
                 <w:rFonts w:ascii="Arial" w:hAnsi="Arial"/>
                 <w:sz w:val="18"/>
               </w:rPr>
-              <w:t>Your subscription — AI Toolkit Legal</w:t>
+              <w:t>View Order</w:t>
             </w:r>
           </w:p>
         </w:tc>
@@ -31061,7 +31061,7 @@
                 <w:rFonts w:ascii="Arial" w:hAnsi="Arial"/>
                 <w:sz w:val="18"/>
               </w:rPr>
-              <w:t>receipt-finance.png</w:t>
+              <w:t>(empty)</w:t>
             </w:r>
           </w:p>
         </w:tc>
@@ -31076,7 +31076,7 @@
                 <w:rFonts w:ascii="Arial" w:hAnsi="Arial"/>
                 <w:sz w:val="18"/>
               </w:rPr>
-              <w:t>600 × 200 px</w:t>
+              <w:t>View Order</w:t>
             </w:r>
           </w:p>
         </w:tc>
@@ -31091,7 +31091,7 @@
                 <w:rFonts w:ascii="Arial" w:hAnsi="Arial"/>
                 <w:sz w:val="18"/>
               </w:rPr>
-              <w:t>Your subscription — AI Toolkit Finance &amp; Accounting</w:t>
+              <w:t>View Order</w:t>
             </w:r>
           </w:p>
         </w:tc>
@@ -31123,7 +31123,7 @@
                 <w:rFonts w:ascii="Arial" w:hAnsi="Arial"/>
                 <w:sz w:val="18"/>
               </w:rPr>
-              <w:t>receipt-marketing.png</w:t>
+              <w:t>(empty)</w:t>
             </w:r>
           </w:p>
         </w:tc>
@@ -31138,7 +31138,7 @@
                 <w:rFonts w:ascii="Arial" w:hAnsi="Arial"/>
                 <w:sz w:val="18"/>
               </w:rPr>
-              <w:t>600 × 200 px</w:t>
+              <w:t>View Order</w:t>
             </w:r>
           </w:p>
         </w:tc>
@@ -31153,7 +31153,7 @@
                 <w:rFonts w:ascii="Arial" w:hAnsi="Arial"/>
                 <w:sz w:val="18"/>
               </w:rPr>
-              <w:t>Your subscription — AI Toolkit Marketing &amp; Comms</w:t>
+              <w:t>View Order</w:t>
             </w:r>
           </w:p>
         </w:tc>
@@ -31185,7 +31185,7 @@
                 <w:rFonts w:ascii="Arial" w:hAnsi="Arial"/>
                 <w:sz w:val="18"/>
               </w:rPr>
-              <w:t>receipt-rh.png</w:t>
+              <w:t>(empty)</w:t>
             </w:r>
           </w:p>
         </w:tc>
@@ -31200,7 +31200,7 @@
                 <w:rFonts w:ascii="Arial" w:hAnsi="Arial"/>
                 <w:sz w:val="18"/>
               </w:rPr>
-              <w:t>600 × 200 px</w:t>
+              <w:t>View Order</w:t>
             </w:r>
           </w:p>
         </w:tc>
@@ -31215,7 +31215,7 @@
                 <w:rFonts w:ascii="Arial" w:hAnsi="Arial"/>
                 <w:sz w:val="18"/>
               </w:rPr>
-              <w:t>Your subscription — AI Toolkit Human Resources</w:t>
+              <w:t>View Order</w:t>
             </w:r>
           </w:p>
         </w:tc>
@@ -31247,7 +31247,7 @@
                 <w:rFonts w:ascii="Arial" w:hAnsi="Arial"/>
                 <w:sz w:val="18"/>
               </w:rPr>
-              <w:t>receipt-sante.png</w:t>
+              <w:t>(empty)</w:t>
             </w:r>
           </w:p>
         </w:tc>
@@ -31262,7 +31262,7 @@
                 <w:rFonts w:ascii="Arial" w:hAnsi="Arial"/>
                 <w:sz w:val="18"/>
               </w:rPr>
-              <w:t>600 × 200 px</w:t>
+              <w:t>View Order</w:t>
             </w:r>
           </w:p>
         </w:tc>
@@ -31277,7 +31277,7 @@
                 <w:rFonts w:ascii="Arial" w:hAnsi="Arial"/>
                 <w:sz w:val="18"/>
               </w:rPr>
-              <w:t>Your subscription — AI Toolkit Health &amp; Wellness</w:t>
+              <w:t>View Order</w:t>
             </w:r>
           </w:p>
         </w:tc>
@@ -31309,7 +31309,7 @@
                 <w:rFonts w:ascii="Arial" w:hAnsi="Arial"/>
                 <w:sz w:val="18"/>
               </w:rPr>
-              <w:t>receipt-education.png</w:t>
+              <w:t>(empty)</w:t>
             </w:r>
           </w:p>
         </w:tc>
@@ -31324,7 +31324,7 @@
                 <w:rFonts w:ascii="Arial" w:hAnsi="Arial"/>
                 <w:sz w:val="18"/>
               </w:rPr>
-              <w:t>600 × 200 px</w:t>
+              <w:t>View Order</w:t>
             </w:r>
           </w:p>
         </w:tc>
@@ -31339,7 +31339,7 @@
                 <w:rFonts w:ascii="Arial" w:hAnsi="Arial"/>
                 <w:sz w:val="18"/>
               </w:rPr>
-              <w:t>Your subscription — AI Toolkit Education &amp; Training</w:t>
+              <w:t>View Order</w:t>
             </w:r>
           </w:p>
         </w:tc>
@@ -31371,7 +31371,7 @@
                 <w:rFonts w:ascii="Arial" w:hAnsi="Arial"/>
                 <w:sz w:val="18"/>
               </w:rPr>
-              <w:t>receipt-restauration.png</w:t>
+              <w:t>(empty)</w:t>
             </w:r>
           </w:p>
         </w:tc>
@@ -31386,7 +31386,7 @@
                 <w:rFonts w:ascii="Arial" w:hAnsi="Arial"/>
                 <w:sz w:val="18"/>
               </w:rPr>
-              <w:t>600 × 200 px</w:t>
+              <w:t>View Order</w:t>
             </w:r>
           </w:p>
         </w:tc>
@@ -31401,7 +31401,7 @@
                 <w:rFonts w:ascii="Arial" w:hAnsi="Arial"/>
                 <w:sz w:val="18"/>
               </w:rPr>
-              <w:t>Your subscription — AI Toolkit Food &amp; Hospitality</w:t>
+              <w:t>View Order</w:t>
             </w:r>
           </w:p>
         </w:tc>
@@ -31433,7 +31433,7 @@
                 <w:rFonts w:ascii="Arial" w:hAnsi="Arial"/>
                 <w:sz w:val="18"/>
               </w:rPr>
-              <w:t>receipt-freelance.png</w:t>
+              <w:t>(empty)</w:t>
             </w:r>
           </w:p>
         </w:tc>
@@ -31448,7 +31448,7 @@
                 <w:rFonts w:ascii="Arial" w:hAnsi="Arial"/>
                 <w:sz w:val="18"/>
               </w:rPr>
-              <w:t>600 × 200 px</w:t>
+              <w:t>View Order</w:t>
             </w:r>
           </w:p>
         </w:tc>
@@ -31463,7 +31463,7 @@
                 <w:rFonts w:ascii="Arial" w:hAnsi="Arial"/>
                 <w:sz w:val="18"/>
               </w:rPr>
-              <w:t>Your subscription — AI Toolkit Freelancers &amp; Consultants</w:t>
+              <w:t>View Order</w:t>
             </w:r>
           </w:p>
         </w:tc>
@@ -31619,7 +31619,7 @@
                 <w:b/>
                 <w:sz w:val="18"/>
               </w:rPr>
-              <w:t>Custom text</w:t>
+              <w:t>Button link</w:t>
             </w:r>
           </w:p>
         </w:tc>
@@ -31656,7 +31656,7 @@
                 <w:b/>
                 <w:sz w:val="18"/>
               </w:rPr>
-              <w:t>Footer</w:t>
+              <w:t>(footer — auto by LS)</w:t>
             </w:r>
           </w:p>
         </w:tc>

</xml_diff>